<commit_message>
docs: fix Arabic grammar, terminology, and formatting defects across chapters 01 sections 01-03
</commit_message>
<xml_diff>
--- a/exports/docx/sections/Chapter-01/section-03.ar.docx
+++ b/exports/docx/sections/Chapter-01/section-03.ar.docx
@@ -3646,12 +3646,11 @@
         </w:rPr>
         <w:t xml:space="preserve">ما يجعل هذه الأسئلة قابلة للتعلم والتطبيق المنهجي هو أنها مُشتقة من مجموعة محدودة نسبياً من أنماط الفشل المتكررة في الأنظمة الموزعة. الأنظمة الموزعة لا تفشل بطرق لانهائية غير متوقعة — إنها تفشل بطرق يمكن تصنيفها وتوثيقها وتعلّمها من تجربة الآخرين. المهندس الذي يستثمر في بناء هذا المعجم من أنماط الفشل يُوسّع مداه المعماري بشكل مضطرد، مما يجعل كل أداة وكل خدمة وكل نمط تكامل جديد أسهل في التقييم بشكل صحيح من السابق. هذا هو التراكم الحقيقي في هندسة البرمجيات المحترفة.</w:t>
       </w:r>
-      <w:r>
-        <w:rPr>
-          <w:rtl/>
-        </w:rPr>
-        <w:t xml:space="preserve"> </w:t>
-      </w:r>
+    </w:p>
+    <w:p>
+      <w:pPr>
+        <w:bidi/>
+      </w:pPr>
       <w:r>
         <w:rPr>
           <w:rtl/>

</xml_diff>